<commit_message>
Set current job title to Senior MLOps Engineer
Confirmed title for the Multiverse Computing role. Update the header
headline to lead with it as well, restoring the seniority the source
resume carried.

Co-Authored-By: Claude Opus 5 <noreply@anthropic.com>
Claude-Session: https://claude.ai/code/session_01D9tpeDWEGo9pkJ5WAKXXxn
</commit_message>
<xml_diff>
--- a/outputs/Alok_Saraswat_Europass_CV.docx
+++ b/outputs/Alok_Saraswat_Europass_CV.docx
@@ -59,7 +59,7 @@
           <w:sz w:val="20"/>
           <w:szCs w:val="20"/>
         </w:rPr>
-        <w:t xml:space="preserve">AI / ML Engineer  •  LLM &amp; Voice AI  •  MLOps &amp; Production Deep Learning</w:t>
+        <w:t xml:space="preserve">Senior MLOps Engineer  •  AI / ML  •  LLM &amp; Voice AI  •  Production Deep Learning</w:t>
       </w:r>
     </w:p>
     <w:p>
@@ -858,7 +858,7 @@
                 <w:sz w:val="20"/>
                 <w:szCs w:val="20"/>
               </w:rPr>
-              <w:t xml:space="preserve">AI / ML Engineer</w:t>
+              <w:t xml:space="preserve">Senior MLOps Engineer</w:t>
             </w:r>
           </w:p>
           <w:p>

</xml_diff>